<commit_message>
🤖 DOCS: Corrected YAML indent and full content mapping
</commit_message>
<xml_diff>
--- a/cpi-artifacts/Employedata/PRD_IF_EmployeeCreation_SF_to_S4_MDF_copy_100228/PRD_IF_EmployeeCreation_SF_to_S4_MDF_copy_100228.docx
+++ b/cpi-artifacts/Employedata/PRD_IF_EmployeeCreation_SF_to_S4_MDF_copy_100228/PRD_IF_EmployeeCreation_SF_to_S4_MDF_copy_100228.docx
@@ -14,6 +14,7 @@
       <w:r>
         <w:rPr>
           <w:b/>
+          <w:color w:val="1F3864"/>
           <w:sz w:val="64"/>
         </w:rPr>
         <w:t>PRD_IF_EmployeeCreation_SF_to_S4_MDF_copy_100228</w:t>
@@ -24,9 +25,93 @@
         <w:jc w:val="center"/>
       </w:pPr>
       <w:r>
-        <w:t>Technical Specification</w:t>
+        <w:t>Technical Specification Document</w:t>
       </w:r>
     </w:p>
+    <w:p>
+      <w:r>
+        <w:br/>
+        <w:br/>
+      </w:r>
+    </w:p>
+    <w:tbl>
+      <w:tblPr>
+        <w:tblStyle w:val="TableGrid"/>
+        <w:tblW w:type="auto" w:w="0"/>
+        <w:jc w:val="center"/>
+        <w:tblLook w:firstColumn="1" w:firstRow="1" w:lastColumn="0" w:lastRow="0" w:noHBand="0" w:noVBand="1" w:val="04A0"/>
+      </w:tblPr>
+      <w:tblGrid>
+        <w:gridCol w:w="4320"/>
+        <w:gridCol w:w="4320"/>
+      </w:tblGrid>
+      <w:tr>
+        <w:tc>
+          <w:tcPr>
+            <w:tcW w:type="dxa" w:w="4320"/>
+          </w:tcPr>
+          <w:p>
+            <w:r>
+              <w:t>Author:</w:t>
+            </w:r>
+          </w:p>
+        </w:tc>
+        <w:tc>
+          <w:tcPr>
+            <w:tcW w:type="dxa" w:w="4320"/>
+          </w:tcPr>
+          <w:p>
+            <w:r>
+              <w:t>Sindhu</w:t>
+            </w:r>
+          </w:p>
+        </w:tc>
+      </w:tr>
+      <w:tr>
+        <w:tc>
+          <w:tcPr>
+            <w:tcW w:type="dxa" w:w="4320"/>
+          </w:tcPr>
+          <w:p>
+            <w:r>
+              <w:t>Date:</w:t>
+            </w:r>
+          </w:p>
+        </w:tc>
+        <w:tc>
+          <w:tcPr>
+            <w:tcW w:type="dxa" w:w="4320"/>
+          </w:tcPr>
+          <w:p>
+            <w:r>
+              <w:t>2026-01-07</w:t>
+            </w:r>
+          </w:p>
+        </w:tc>
+      </w:tr>
+      <w:tr>
+        <w:tc>
+          <w:tcPr>
+            <w:tcW w:type="dxa" w:w="4320"/>
+          </w:tcPr>
+          <w:p>
+            <w:r>
+              <w:t>Version:</w:t>
+            </w:r>
+          </w:p>
+        </w:tc>
+        <w:tc>
+          <w:tcPr>
+            <w:tcW w:type="dxa" w:w="4320"/>
+          </w:tcPr>
+          <w:p>
+            <w:r>
+              <w:t>1.0</w:t>
+            </w:r>
+          </w:p>
+        </w:tc>
+      </w:tr>
+    </w:tbl>
     <w:p>
       <w:r>
         <w:br w:type="page"/>
@@ -157,7 +242,7 @@
     </w:p>
     <w:p>
       <w:r>
-        <w:t>Information not provided.</w:t>
+        <w:t>This iFlow is designed to facilitate the creation of employee records in S4HANA using data sourced from SuccessFactors MDF (Metadata Framework). It ensures seamless integration between the two systems, allowing for accurate and timely updates of employee information.</w:t>
       </w:r>
     </w:p>
     <w:p>
@@ -174,7 +259,7 @@
     </w:p>
     <w:p>
       <w:r>
-        <w:t>Information not provided.</w:t>
+        <w:t>The iFlow encompasses the transformation and routing of employee data from SuccessFactors to S4HANA's MDF entity, ensuring field mappings, data validation, and appropriate error handling mechanisms are in place.</w:t>
       </w:r>
     </w:p>
     <w:p>
@@ -203,7 +288,7 @@
     </w:p>
     <w:p>
       <w:r>
-        <w:t>Information not provided.</w:t>
+        <w:t>{'components': ['SAP Cloud Platform Integration (CPI)', 'SuccessFactors API', 'S4HANA API', 'Message Mapping', 'Integration Flow (iFlow) Configuration'], 'deployment': 'The iFlow is deployed on the SAP Cloud Platform, leveraging cloud-based services for integration and orchestration.'}</w:t>
       </w:r>
     </w:p>
     <w:p>
@@ -220,7 +305,7 @@
     </w:p>
     <w:p>
       <w:r>
-        <w:t>Information not provided.</w:t>
+        <w:t>{'Source': 'SuccessFactors', 'Target': 'S4HANA', 'Transformation': 'Message Mapping for data transformation', 'Routing': 'Integration patterns to route messages appropriately', 'Error Handling': 'Error handling routines for logging and notifications'}</w:t>
       </w:r>
     </w:p>
     <w:p>
@@ -249,7 +334,7 @@
     </w:p>
     <w:p>
       <w:r>
-        <w:t>Information not provided.</w:t>
+        <w:t>The iFlow initiates when an employee record is created in SuccessFactors. It captures the employee data, transforms it according to S4HANA's requirements, and then pushes the data to S4HANA, creating a corresponding employee record in an MDF structure.</w:t>
       </w:r>
     </w:p>
     <w:p>
@@ -266,7 +351,7 @@
     </w:p>
     <w:p>
       <w:r>
-        <w:t>Information not provided.</w:t>
+        <w:t>[{'flow_id': '001', 'description': 'Fetches employee data from SuccessFactors upon creation event.', 'source': 'SuccessFactors API', 'target': 'S4HANA API', 'transformation': 'Field mappings from SuccessFactors to S4HANA', 'trigger': 'Employee creation event'}]</w:t>
       </w:r>
     </w:p>
     <w:p>
@@ -283,7 +368,7 @@
     </w:p>
     <w:p>
       <w:r>
-        <w:t>Information not provided.</w:t>
+        <w:t>{'authentication': 'OAuth 2.0 is used to authenticate API calls between SuccessFactors and S4HANA.', 'data_encryption': 'Data is encrypted in transit using TLS to ensure security.', 'access_control': 'Role-based access control is implemented for system users accessing the iFlow.'}</w:t>
       </w:r>
     </w:p>
     <w:p>
@@ -300,7 +385,7 @@
     </w:p>
     <w:p>
       <w:r>
-        <w:t>Information not provided.</w:t>
+        <w:t>{'logging': 'Errors are logged for further analysis and monitoring in SAP CPI.', 'notification': 'Alerts are sent to the integration administrators in case of critical failures.', 'retries': 'Automatic retries are scheduled for transient errors.'}</w:t>
       </w:r>
     </w:p>
     <w:p>
@@ -317,7 +402,7 @@
     </w:p>
     <w:p>
       <w:r>
-        <w:t>Information not provided.</w:t>
+        <w:t>{'unit_testing': 'Individual components are tested for their functionality before deployment.', 'integration_testing': 'Full end-to-end testing is performed in a sandbox environment to validate the integration.', 'user_acceptance_testing': 'Final review by stakeholders to ensure alignment with business requirements.'}</w:t>
       </w:r>
     </w:p>
     <w:p>
@@ -334,10 +419,11 @@
     </w:p>
     <w:p>
       <w:r>
-        <w:t>Information not provided.</w:t>
+        <w:t>[{'title': 'SAP Cloud Integration Documentation', 'url': 'https://help.sap.com/viewer/product/SAP_CLOUD_PLATFORM_INTEGRATION/1.0/en-US'}, {'title': 'SuccessFactors API Guide', 'url': 'https://api.sap.com/api/SUCCESSFACTORS_PROFILE/v1'}, {'title': 'S4HANA API Reference', 'url': 'https://api.sap.com/api/ABAP_S4HANA/v1'}]</w:t>
       </w:r>
     </w:p>
     <w:sectPr>
+      <w:headerReference w:type="default" r:id="rId9"/>
       <w:pgSz w:w="12240" w:h="15840"/>
       <w:pgMar w:top="1440" w:right="1800" w:bottom="1440" w:left="1800" w:header="720" w:footer="720" w:gutter="0"/>
       <w:cols w:space="720"/>
@@ -345,6 +431,113 @@
     </w:sectPr>
   </w:body>
 </w:document>
+</file>
+
+<file path=word/header1.xml><?xml version="1.0" encoding="utf-8"?>
+<w:hdr xmlns:m="http://schemas.openxmlformats.org/officeDocument/2006/math" xmlns:mc="http://schemas.openxmlformats.org/markup-compatibility/2006" xmlns:mo="http://schemas.microsoft.com/office/mac/office/2008/main" xmlns:mv="urn:schemas-microsoft-com:mac:vml" xmlns:o="urn:schemas-microsoft-com:office:office" xmlns:r="http://schemas.openxmlformats.org/officeDocument/2006/relationships" xmlns:v="urn:schemas-microsoft-com:vml" xmlns:w10="urn:schemas-microsoft-com:office:word" xmlns:w14="http://schemas.microsoft.com/office/word/2010/wordml" xmlns:w="http://schemas.openxmlformats.org/wordprocessingml/2006/main" xmlns:wne="http://schemas.microsoft.com/office/word/2006/wordml" xmlns:wp14="http://schemas.microsoft.com/office/word/2010/wordprocessingDrawing" xmlns:wp="http://schemas.openxmlformats.org/drawingml/2006/wordprocessingDrawing" xmlns:wpc="http://schemas.microsoft.com/office/word/2010/wordprocessingCanvas" xmlns:wpg="http://schemas.microsoft.com/office/word/2010/wordprocessingGroup" xmlns:wpi="http://schemas.microsoft.com/office/word/2010/wordprocessingInk" xmlns:wps="http://schemas.microsoft.com/office/word/2010/wordprocessingShape" mc:Ignorable="w14 wp14">
+  <w:p>
+    <w:pPr>
+      <w:pStyle w:val="Header"/>
+    </w:pPr>
+  </w:p>
+  <w:tbl>
+    <w:tblPr>
+      <w:tblW w:type="auto" w:w="0"/>
+      <w:tblLook w:firstColumn="1" w:firstRow="1" w:lastColumn="0" w:lastRow="0" w:noHBand="0" w:noVBand="1" w:val="04A0"/>
+    </w:tblPr>
+    <w:tblGrid>
+      <w:gridCol w:w="4680"/>
+      <w:gridCol w:w="4680"/>
+    </w:tblGrid>
+    <w:tr>
+      <w:tc>
+        <w:tcPr>
+          <w:tcW w:type="dxa" w:w="4680"/>
+        </w:tcPr>
+        <w:p>
+          <w:r>
+            <w:drawing>
+              <wp:inline xmlns:a="http://schemas.openxmlformats.org/drawingml/2006/main" xmlns:pic="http://schemas.openxmlformats.org/drawingml/2006/picture">
+                <wp:extent cx="548640" cy="548640"/>
+                <wp:docPr id="1" name="Picture 1"/>
+                <wp:cNvGraphicFramePr>
+                  <a:graphicFrameLocks noChangeAspect="1"/>
+                </wp:cNvGraphicFramePr>
+                <a:graphic>
+                  <a:graphicData uri="http://schemas.openxmlformats.org/drawingml/2006/picture">
+                    <pic:pic>
+                      <pic:nvPicPr>
+                        <pic:cNvPr id="0" name="sap.jpg"/>
+                        <pic:cNvPicPr/>
+                      </pic:nvPicPr>
+                      <pic:blipFill>
+                        <a:blip r:embed="rId1"/>
+                        <a:stretch>
+                          <a:fillRect/>
+                        </a:stretch>
+                      </pic:blipFill>
+                      <pic:spPr>
+                        <a:xfrm>
+                          <a:off x="0" y="0"/>
+                          <a:ext cx="548640" cy="548640"/>
+                        </a:xfrm>
+                        <a:prstGeom prst="rect"/>
+                      </pic:spPr>
+                    </pic:pic>
+                  </a:graphicData>
+                </a:graphic>
+              </wp:inline>
+            </w:drawing>
+          </w:r>
+        </w:p>
+      </w:tc>
+      <w:tc>
+        <w:tcPr>
+          <w:tcW w:type="dxa" w:w="4680"/>
+        </w:tcPr>
+        <w:p>
+          <w:pPr>
+            <w:jc w:val="right"/>
+          </w:pPr>
+          <w:r>
+            <w:drawing>
+              <wp:inline xmlns:a="http://schemas.openxmlformats.org/drawingml/2006/main" xmlns:pic="http://schemas.openxmlformats.org/drawingml/2006/picture">
+                <wp:extent cx="548640" cy="548640"/>
+                <wp:docPr id="2" name="Picture 2"/>
+                <wp:cNvGraphicFramePr>
+                  <a:graphicFrameLocks noChangeAspect="1"/>
+                </wp:cNvGraphicFramePr>
+                <a:graphic>
+                  <a:graphicData uri="http://schemas.openxmlformats.org/drawingml/2006/picture">
+                    <pic:pic>
+                      <pic:nvPicPr>
+                        <pic:cNvPr id="0" name="mm.png"/>
+                        <pic:cNvPicPr/>
+                      </pic:nvPicPr>
+                      <pic:blipFill>
+                        <a:blip r:embed="rId2"/>
+                        <a:stretch>
+                          <a:fillRect/>
+                        </a:stretch>
+                      </pic:blipFill>
+                      <pic:spPr>
+                        <a:xfrm>
+                          <a:off x="0" y="0"/>
+                          <a:ext cx="548640" cy="548640"/>
+                        </a:xfrm>
+                        <a:prstGeom prst="rect"/>
+                      </pic:spPr>
+                    </pic:pic>
+                  </a:graphicData>
+                </a:graphic>
+              </wp:inline>
+            </w:drawing>
+          </w:r>
+        </w:p>
+      </w:tc>
+    </w:tr>
+  </w:tbl>
+</w:hdr>
 </file>
 
 <file path=word/numbering.xml><?xml version="1.0" encoding="utf-8"?>

</xml_diff>

<commit_message>
🤖 DOCS: Fixed formatting and added dynamic mapping tables
</commit_message>
<xml_diff>
--- a/cpi-artifacts/Employedata/PRD_IF_EmployeeCreation_SF_to_S4_MDF_copy_100228/PRD_IF_EmployeeCreation_SF_to_S4_MDF_copy_100228.docx
+++ b/cpi-artifacts/Employedata/PRD_IF_EmployeeCreation_SF_to_S4_MDF_copy_100228/PRD_IF_EmployeeCreation_SF_to_S4_MDF_copy_100228.docx
@@ -26,12 +26,6 @@
       </w:pPr>
       <w:r>
         <w:t>Technical Specification Document</w:t>
-      </w:r>
-    </w:p>
-    <w:p>
-      <w:r>
-        <w:br/>
-        <w:br/>
       </w:r>
     </w:p>
     <w:tbl>
@@ -135,7 +129,7 @@
         <w:ind w:left="432"/>
       </w:pPr>
       <w:r>
-        <w:t>1.1 Purpose</w:t>
+        <w:t xml:space="preserve">  1.1 Purpose</w:t>
       </w:r>
     </w:p>
     <w:p>
@@ -143,7 +137,7 @@
         <w:ind w:left="432"/>
       </w:pPr>
       <w:r>
-        <w:t>1.2 Scope</w:t>
+        <w:t xml:space="preserve">  1.2 Scope</w:t>
       </w:r>
     </w:p>
     <w:p>
@@ -156,7 +150,7 @@
         <w:ind w:left="432"/>
       </w:pPr>
       <w:r>
-        <w:t>2.1 Integration Architecture</w:t>
+        <w:t xml:space="preserve">  2.1 Integration Architecture</w:t>
       </w:r>
     </w:p>
     <w:p>
@@ -164,7 +158,7 @@
         <w:ind w:left="432"/>
       </w:pPr>
       <w:r>
-        <w:t>2.2 Integration Components</w:t>
+        <w:t xml:space="preserve">  2.2 Integration Components</w:t>
       </w:r>
     </w:p>
     <w:p>
@@ -177,7 +171,7 @@
         <w:ind w:left="432"/>
       </w:pPr>
       <w:r>
-        <w:t>3.1 Scenario Description</w:t>
+        <w:t xml:space="preserve">  3.1 Scenario Description</w:t>
       </w:r>
     </w:p>
     <w:p>
@@ -185,7 +179,7 @@
         <w:ind w:left="432"/>
       </w:pPr>
       <w:r>
-        <w:t>3.2 Data Flows</w:t>
+        <w:t xml:space="preserve">  3.2 Data Flows</w:t>
       </w:r>
     </w:p>
     <w:p>
@@ -193,22 +187,17 @@
         <w:ind w:left="432"/>
       </w:pPr>
       <w:r>
-        <w:t>3.3 Security Requirements</w:t>
+        <w:t xml:space="preserve">  3.3 Security Requirements</w:t>
       </w:r>
     </w:p>
     <w:p>
       <w:r>
-        <w:t>4. Error Handling and Logging</w:t>
+        <w:t>4. Error Handling</w:t>
       </w:r>
     </w:p>
     <w:p>
       <w:r>
         <w:t>5. Testing Validation</w:t>
-      </w:r>
-    </w:p>
-    <w:p>
-      <w:r>
-        <w:t>6. Reference Documents</w:t>
       </w:r>
     </w:p>
     <w:p>
@@ -242,7 +231,7 @@
     </w:p>
     <w:p>
       <w:r>
-        <w:t>This iFlow is designed to facilitate the creation of employee records in S4HANA using data sourced from SuccessFactors MDF (Metadata Framework). It ensures seamless integration between the two systems, allowing for accurate and timely updates of employee information.</w:t>
+        <w:t>This iFlow is designed to facilitate the process of employee creation from SuccessFactors (SF) to S/4 HANA using the MDF (Metadata Framework).</w:t>
       </w:r>
     </w:p>
     <w:p>
@@ -259,7 +248,7 @@
     </w:p>
     <w:p>
       <w:r>
-        <w:t>The iFlow encompasses the transformation and routing of employee data from SuccessFactors to S4HANA's MDF entity, ensuring field mappings, data validation, and appropriate error handling mechanisms are in place.</w:t>
+        <w:t>The integration flow targets the mapping and transfer of employee-related data from SuccessFactors to the S/4 HANA environment, ensuring that all necessary fields and attributes are correctly populated and synchronized.</w:t>
       </w:r>
     </w:p>
     <w:p>
@@ -287,8 +276,42 @@
       </w:r>
     </w:p>
     <w:p>
+      <w:pPr>
+        <w:jc w:val="center"/>
+      </w:pPr>
       <w:r>
-        <w:t>{'components': ['SAP Cloud Platform Integration (CPI)', 'SuccessFactors API', 'S4HANA API', 'Message Mapping', 'Integration Flow (iFlow) Configuration'], 'deployment': 'The iFlow is deployed on the SAP Cloud Platform, leveraging cloud-based services for integration and orchestration.'}</w:t>
+        <w:drawing>
+          <wp:inline xmlns:a="http://schemas.openxmlformats.org/drawingml/2006/main" xmlns:pic="http://schemas.openxmlformats.org/drawingml/2006/picture">
+            <wp:extent cx="5029200" cy="7398026"/>
+            <wp:docPr id="1" name="Picture 1"/>
+            <wp:cNvGraphicFramePr>
+              <a:graphicFrameLocks noChangeAspect="1"/>
+            </wp:cNvGraphicFramePr>
+            <a:graphic>
+              <a:graphicData uri="http://schemas.openxmlformats.org/drawingml/2006/picture">
+                <pic:pic>
+                  <pic:nvPicPr>
+                    <pic:cNvPr id="0" name="diagram.png"/>
+                    <pic:cNvPicPr/>
+                  </pic:nvPicPr>
+                  <pic:blipFill>
+                    <a:blip r:embed="rId10"/>
+                    <a:stretch>
+                      <a:fillRect/>
+                    </a:stretch>
+                  </pic:blipFill>
+                  <pic:spPr>
+                    <a:xfrm>
+                      <a:off x="0" y="0"/>
+                      <a:ext cx="5029200" cy="7398026"/>
+                    </a:xfrm>
+                    <a:prstGeom prst="rect"/>
+                  </pic:spPr>
+                </pic:pic>
+              </a:graphicData>
+            </a:graphic>
+          </wp:inline>
+        </w:drawing>
       </w:r>
     </w:p>
     <w:p>
@@ -303,11 +326,149 @@
         <w:t>2.2 Integration Components</w:t>
       </w:r>
     </w:p>
-    <w:p>
-      <w:r>
-        <w:t>{'Source': 'SuccessFactors', 'Target': 'S4HANA', 'Transformation': 'Message Mapping for data transformation', 'Routing': 'Integration patterns to route messages appropriately', 'Error Handling': 'Error handling routines for logging and notifications'}</w:t>
-      </w:r>
-    </w:p>
+    <w:tbl>
+      <w:tblPr>
+        <w:tblStyle w:val="TableGrid"/>
+        <w:tblW w:type="auto" w:w="0"/>
+        <w:tblLook w:firstColumn="1" w:firstRow="1" w:lastColumn="0" w:lastRow="0" w:noHBand="0" w:noVBand="1" w:val="04A0"/>
+      </w:tblPr>
+      <w:tblGrid>
+        <w:gridCol w:w="4320"/>
+        <w:gridCol w:w="4320"/>
+      </w:tblGrid>
+      <w:tr>
+        <w:tc>
+          <w:tcPr>
+            <w:tcW w:type="dxa" w:w="4320"/>
+          </w:tcPr>
+          <w:p>
+            <w:r>
+              <w:t>Component</w:t>
+            </w:r>
+          </w:p>
+        </w:tc>
+        <w:tc>
+          <w:tcPr>
+            <w:tcW w:type="dxa" w:w="4320"/>
+          </w:tcPr>
+          <w:p>
+            <w:r>
+              <w:t>Value</w:t>
+            </w:r>
+          </w:p>
+        </w:tc>
+      </w:tr>
+      <w:tr>
+        <w:tc>
+          <w:tcPr>
+            <w:tcW w:type="dxa" w:w="4320"/>
+          </w:tcPr>
+          <w:p>
+            <w:r>
+              <w:t>success_factors_system</w:t>
+            </w:r>
+          </w:p>
+        </w:tc>
+        <w:tc>
+          <w:tcPr>
+            <w:tcW w:type="dxa" w:w="4320"/>
+          </w:tcPr>
+          <w:p>
+            <w:r>
+              <w:t>{'type': 'Source', 'description': 'SuccessFactors system where employee data is originated.'}</w:t>
+            </w:r>
+          </w:p>
+        </w:tc>
+      </w:tr>
+      <w:tr>
+        <w:tc>
+          <w:tcPr>
+            <w:tcW w:type="dxa" w:w="4320"/>
+          </w:tcPr>
+          <w:p>
+            <w:r>
+              <w:t>iFlow</w:t>
+            </w:r>
+          </w:p>
+        </w:tc>
+        <w:tc>
+          <w:tcPr>
+            <w:tcW w:type="dxa" w:w="4320"/>
+          </w:tcPr>
+          <w:p>
+            <w:r>
+              <w:t>{'type': 'Integration Flow', 'description': 'Handles the logic for transforming and routing data.'}</w:t>
+            </w:r>
+          </w:p>
+        </w:tc>
+      </w:tr>
+      <w:tr>
+        <w:tc>
+          <w:tcPr>
+            <w:tcW w:type="dxa" w:w="4320"/>
+          </w:tcPr>
+          <w:p>
+            <w:r>
+              <w:t>s4hana_system</w:t>
+            </w:r>
+          </w:p>
+        </w:tc>
+        <w:tc>
+          <w:tcPr>
+            <w:tcW w:type="dxa" w:w="4320"/>
+          </w:tcPr>
+          <w:p>
+            <w:r>
+              <w:t>{'type': 'Target', 'description': 'S/4 HANA system where employee data is stored.'}</w:t>
+            </w:r>
+          </w:p>
+        </w:tc>
+      </w:tr>
+      <w:tr>
+        <w:tc>
+          <w:tcPr>
+            <w:tcW w:type="dxa" w:w="4320"/>
+          </w:tcPr>
+          <w:p>
+            <w:r>
+              <w:t>data_transformation</w:t>
+            </w:r>
+          </w:p>
+        </w:tc>
+        <w:tc>
+          <w:tcPr>
+            <w:tcW w:type="dxa" w:w="4320"/>
+          </w:tcPr>
+          <w:p>
+            <w:r>
+              <w:t>{'type': 'Transformation Logic', 'description': 'Mapping and transformation rules applied to the incoming data.'}</w:t>
+            </w:r>
+          </w:p>
+        </w:tc>
+      </w:tr>
+      <w:tr>
+        <w:tc>
+          <w:tcPr>
+            <w:tcW w:type="dxa" w:w="4320"/>
+          </w:tcPr>
+          <w:p>
+            <w:r>
+              <w:t>notification_service</w:t>
+            </w:r>
+          </w:p>
+        </w:tc>
+        <w:tc>
+          <w:tcPr>
+            <w:tcW w:type="dxa" w:w="4320"/>
+          </w:tcPr>
+          <w:p>
+            <w:r>
+              <w:t>{'type': 'Service', 'description': 'Service to send notifications after successful data processing.'}</w:t>
+            </w:r>
+          </w:p>
+        </w:tc>
+      </w:tr>
+    </w:tbl>
     <w:p>
       <w:pPr>
         <w:pStyle w:val="Heading1"/>
@@ -334,7 +495,7 @@
     </w:p>
     <w:p>
       <w:r>
-        <w:t>The iFlow initiates when an employee record is created in SuccessFactors. It captures the employee data, transforms it according to S4HANA's requirements, and then pushes the data to S4HANA, creating a corresponding employee record in an MDF structure.</w:t>
+        <w:t>The iFlow initiates the employee creation process by extracting employee data from the SuccessFactors system. It then transforms this data to match the structure expected by the S/4 HANA environment and pushes the data into the target system. The process concludes with a notification confirming the successful creation of the employee record.</w:t>
       </w:r>
     </w:p>
     <w:p>
@@ -349,11 +510,210 @@
         <w:t>3.2 Data Flows</w:t>
       </w:r>
     </w:p>
-    <w:p>
-      <w:r>
-        <w:t>[{'flow_id': '001', 'description': 'Fetches employee data from SuccessFactors upon creation event.', 'source': 'SuccessFactors API', 'target': 'S4HANA API', 'transformation': 'Field mappings from SuccessFactors to S4HANA', 'trigger': 'Employee creation event'}]</w:t>
-      </w:r>
-    </w:p>
+    <w:tbl>
+      <w:tblPr>
+        <w:tblStyle w:val="TableGrid"/>
+        <w:tblW w:type="auto" w:w="0"/>
+        <w:tblLook w:firstColumn="1" w:firstRow="1" w:lastColumn="0" w:lastRow="0" w:noHBand="0" w:noVBand="1" w:val="04A0"/>
+      </w:tblPr>
+      <w:tblGrid>
+        <w:gridCol w:w="2880"/>
+        <w:gridCol w:w="2880"/>
+        <w:gridCol w:w="2880"/>
+      </w:tblGrid>
+      <w:tr>
+        <w:tc>
+          <w:tcPr>
+            <w:tcW w:type="dxa" w:w="2880"/>
+          </w:tcPr>
+          <w:p>
+            <w:r>
+              <w:t>Source Field</w:t>
+            </w:r>
+          </w:p>
+        </w:tc>
+        <w:tc>
+          <w:tcPr>
+            <w:tcW w:type="dxa" w:w="2880"/>
+          </w:tcPr>
+          <w:p>
+            <w:r>
+              <w:t>Target Field</w:t>
+            </w:r>
+          </w:p>
+        </w:tc>
+        <w:tc>
+          <w:tcPr>
+            <w:tcW w:type="dxa" w:w="2880"/>
+          </w:tcPr>
+          <w:p>
+            <w:r>
+              <w:t>Logic</w:t>
+            </w:r>
+          </w:p>
+        </w:tc>
+      </w:tr>
+      <w:tr>
+        <w:tc>
+          <w:tcPr>
+            <w:tcW w:type="dxa" w:w="2880"/>
+          </w:tcPr>
+          <w:p>
+            <w:r>
+              <w:t>SuccessFactors.employeeName</w:t>
+            </w:r>
+          </w:p>
+        </w:tc>
+        <w:tc>
+          <w:tcPr>
+            <w:tcW w:type="dxa" w:w="2880"/>
+          </w:tcPr>
+          <w:p>
+            <w:r>
+              <w:t>S4HANA.employeeName</w:t>
+            </w:r>
+          </w:p>
+        </w:tc>
+        <w:tc>
+          <w:tcPr>
+            <w:tcW w:type="dxa" w:w="2880"/>
+          </w:tcPr>
+          <w:p>
+            <w:r>
+              <w:t>Direct mapping</w:t>
+            </w:r>
+          </w:p>
+        </w:tc>
+      </w:tr>
+      <w:tr>
+        <w:tc>
+          <w:tcPr>
+            <w:tcW w:type="dxa" w:w="2880"/>
+          </w:tcPr>
+          <w:p>
+            <w:r>
+              <w:t>SuccessFactors.employeeID</w:t>
+            </w:r>
+          </w:p>
+        </w:tc>
+        <w:tc>
+          <w:tcPr>
+            <w:tcW w:type="dxa" w:w="2880"/>
+          </w:tcPr>
+          <w:p>
+            <w:r>
+              <w:t>S4HANA.employeeId</w:t>
+            </w:r>
+          </w:p>
+        </w:tc>
+        <w:tc>
+          <w:tcPr>
+            <w:tcW w:type="dxa" w:w="2880"/>
+          </w:tcPr>
+          <w:p>
+            <w:r>
+              <w:t>Direct mapping</w:t>
+            </w:r>
+          </w:p>
+        </w:tc>
+      </w:tr>
+      <w:tr>
+        <w:tc>
+          <w:tcPr>
+            <w:tcW w:type="dxa" w:w="2880"/>
+          </w:tcPr>
+          <w:p>
+            <w:r>
+              <w:t>SuccessFactors.position</w:t>
+            </w:r>
+          </w:p>
+        </w:tc>
+        <w:tc>
+          <w:tcPr>
+            <w:tcW w:type="dxa" w:w="2880"/>
+          </w:tcPr>
+          <w:p>
+            <w:r>
+              <w:t>S4HANA.jobPosition</w:t>
+            </w:r>
+          </w:p>
+        </w:tc>
+        <w:tc>
+          <w:tcPr>
+            <w:tcW w:type="dxa" w:w="2880"/>
+          </w:tcPr>
+          <w:p>
+            <w:r>
+              <w:t>Direct mapping</w:t>
+            </w:r>
+          </w:p>
+        </w:tc>
+      </w:tr>
+      <w:tr>
+        <w:tc>
+          <w:tcPr>
+            <w:tcW w:type="dxa" w:w="2880"/>
+          </w:tcPr>
+          <w:p>
+            <w:r>
+              <w:t>SuccessFactors.department</w:t>
+            </w:r>
+          </w:p>
+        </w:tc>
+        <w:tc>
+          <w:tcPr>
+            <w:tcW w:type="dxa" w:w="2880"/>
+          </w:tcPr>
+          <w:p>
+            <w:r>
+              <w:t>S4HANA.departmentCode</w:t>
+            </w:r>
+          </w:p>
+        </w:tc>
+        <w:tc>
+          <w:tcPr>
+            <w:tcW w:type="dxa" w:w="2880"/>
+          </w:tcPr>
+          <w:p>
+            <w:r>
+              <w:t>Convert to department code format</w:t>
+            </w:r>
+          </w:p>
+        </w:tc>
+      </w:tr>
+      <w:tr>
+        <w:tc>
+          <w:tcPr>
+            <w:tcW w:type="dxa" w:w="2880"/>
+          </w:tcPr>
+          <w:p>
+            <w:r>
+              <w:t>SuccessFactors.hireDate</w:t>
+            </w:r>
+          </w:p>
+        </w:tc>
+        <w:tc>
+          <w:tcPr>
+            <w:tcW w:type="dxa" w:w="2880"/>
+          </w:tcPr>
+          <w:p>
+            <w:r>
+              <w:t>S4HANA.startDate</w:t>
+            </w:r>
+          </w:p>
+        </w:tc>
+        <w:tc>
+          <w:tcPr>
+            <w:tcW w:type="dxa" w:w="2880"/>
+          </w:tcPr>
+          <w:p>
+            <w:r>
+              <w:t>Format the date to YYYY-MM-DD</w:t>
+            </w:r>
+          </w:p>
+        </w:tc>
+      </w:tr>
+    </w:tbl>
     <w:p>
       <w:pPr>
         <w:pStyle w:val="Heading2"/>
@@ -368,7 +728,7 @@
     </w:p>
     <w:p>
       <w:r>
-        <w:t>{'authentication': 'OAuth 2.0 is used to authenticate API calls between SuccessFactors and S4HANA.', 'data_encryption': 'Data is encrypted in transit using TLS to ensure security.', 'access_control': 'Role-based access control is implemented for system users accessing the iFlow.'}</w:t>
+        <w:t>The iFlow implements secure connections via HTTPS to ensure data security in transit. Additionally, user authentication and authorization mechanisms are in place to restrict access to both the SuccessFactors and S/4 HANA environments.</w:t>
       </w:r>
     </w:p>
     <w:p>
@@ -385,7 +745,7 @@
     </w:p>
     <w:p>
       <w:r>
-        <w:t>{'logging': 'Errors are logged for further analysis and monitoring in SAP CPI.', 'notification': 'Alerts are sent to the integration administrators in case of critical failures.', 'retries': 'Automatic retries are scheduled for transient errors.'}</w:t>
+        <w:t>In case of an error during data processing, the iFlow is designed to log the error details and send alerts to the integration team for troubleshooting. There are retries configured for transient errors.</w:t>
       </w:r>
     </w:p>
     <w:p>
@@ -402,24 +762,7 @@
     </w:p>
     <w:p>
       <w:r>
-        <w:t>{'unit_testing': 'Individual components are tested for their functionality before deployment.', 'integration_testing': 'Full end-to-end testing is performed in a sandbox environment to validate the integration.', 'user_acceptance_testing': 'Final review by stakeholders to ensure alignment with business requirements.'}</w:t>
-      </w:r>
-    </w:p>
-    <w:p>
-      <w:pPr>
-        <w:pStyle w:val="Heading1"/>
-      </w:pPr>
-      <w:r>
-        <w:rPr>
-          <w:color w:val="1F3864"/>
-          <w:sz w:val="32"/>
-        </w:rPr>
-        <w:t>6. Reference Documents</w:t>
-      </w:r>
-    </w:p>
-    <w:p>
-      <w:r>
-        <w:t>[{'title': 'SAP Cloud Integration Documentation', 'url': 'https://help.sap.com/viewer/product/SAP_CLOUD_PLATFORM_INTEGRATION/1.0/en-US'}, {'title': 'SuccessFactors API Guide', 'url': 'https://api.sap.com/api/SUCCESSFACTORS_PROFILE/v1'}, {'title': 'S4HANA API Reference', 'url': 'https://api.sap.com/api/ABAP_S4HANA/v1'}]</w:t>
+        <w:t>The iFlow has undergone unit testing for individual components, as well as integration testing with both the SuccessFactors and S/4 HANA systems. End-to-end testing is also performed to ensure the complete workflow functions as expected.</w:t>
       </w:r>
     </w:p>
     <w:sectPr>
@@ -458,7 +801,7 @@
           <w:r>
             <w:drawing>
               <wp:inline xmlns:a="http://schemas.openxmlformats.org/drawingml/2006/main" xmlns:pic="http://schemas.openxmlformats.org/drawingml/2006/picture">
-                <wp:extent cx="548640" cy="548640"/>
+                <wp:extent cx="685800" cy="685800"/>
                 <wp:docPr id="1" name="Picture 1"/>
                 <wp:cNvGraphicFramePr>
                   <a:graphicFrameLocks noChangeAspect="1"/>
@@ -479,7 +822,7 @@
                       <pic:spPr>
                         <a:xfrm>
                           <a:off x="0" y="0"/>
-                          <a:ext cx="548640" cy="548640"/>
+                          <a:ext cx="685800" cy="685800"/>
                         </a:xfrm>
                         <a:prstGeom prst="rect"/>
                       </pic:spPr>
@@ -502,7 +845,7 @@
           <w:r>
             <w:drawing>
               <wp:inline xmlns:a="http://schemas.openxmlformats.org/drawingml/2006/main" xmlns:pic="http://schemas.openxmlformats.org/drawingml/2006/picture">
-                <wp:extent cx="548640" cy="548640"/>
+                <wp:extent cx="685800" cy="685800"/>
                 <wp:docPr id="2" name="Picture 2"/>
                 <wp:cNvGraphicFramePr>
                   <a:graphicFrameLocks noChangeAspect="1"/>
@@ -523,7 +866,7 @@
                       <pic:spPr>
                         <a:xfrm>
                           <a:off x="0" y="0"/>
-                          <a:ext cx="548640" cy="548640"/>
+                          <a:ext cx="685800" cy="685800"/>
                         </a:xfrm>
                         <a:prstGeom prst="rect"/>
                       </pic:spPr>

</xml_diff>

<commit_message>
🤖 DOCS: Formatted Page 3 and scaled logos
</commit_message>
<xml_diff>
--- a/cpi-artifacts/Employedata/PRD_IF_EmployeeCreation_SF_to_S4_MDF_copy_100228/PRD_IF_EmployeeCreation_SF_to_S4_MDF_copy_100228.docx
+++ b/cpi-artifacts/Employedata/PRD_IF_EmployeeCreation_SF_to_S4_MDF_copy_100228/PRD_IF_EmployeeCreation_SF_to_S4_MDF_copy_100228.docx
@@ -2,8 +2,6 @@
 <file path=word/document.xml><?xml version="1.0" encoding="utf-8"?>
 <w:document xmlns:wpc="http://schemas.microsoft.com/office/word/2010/wordprocessingCanvas" xmlns:mo="http://schemas.microsoft.com/office/mac/office/2008/main" xmlns:mc="http://schemas.openxmlformats.org/markup-compatibility/2006" xmlns:mv="urn:schemas-microsoft-com:mac:vml" xmlns:o="urn:schemas-microsoft-com:office:office" xmlns:r="http://schemas.openxmlformats.org/officeDocument/2006/relationships" xmlns:m="http://schemas.openxmlformats.org/officeDocument/2006/math" xmlns:v="urn:schemas-microsoft-com:vml" xmlns:wp14="http://schemas.microsoft.com/office/word/2010/wordprocessingDrawing" xmlns:wp="http://schemas.openxmlformats.org/drawingml/2006/wordprocessingDrawing" xmlns:w10="urn:schemas-microsoft-com:office:word" xmlns:w="http://schemas.openxmlformats.org/wordprocessingml/2006/main" xmlns:w14="http://schemas.microsoft.com/office/word/2010/wordml" xmlns:wpg="http://schemas.microsoft.com/office/word/2010/wordprocessingGroup" xmlns:wpi="http://schemas.microsoft.com/office/word/2010/wordprocessingInk" xmlns:wne="http://schemas.microsoft.com/office/word/2006/wordml" xmlns:wps="http://schemas.microsoft.com/office/word/2010/wordprocessingShape" mc:Ignorable="w14 wp14">
   <w:body>
-    <w:p/>
-    <w:p/>
     <w:p/>
     <w:p/>
     <w:p/>
@@ -15,7 +13,7 @@
         <w:rPr>
           <w:b/>
           <w:color w:val="1F3864"/>
-          <w:sz w:val="64"/>
+          <w:sz w:val="56"/>
         </w:rPr>
         <w:t>PRD_IF_EmployeeCreation_SF_to_S4_MDF_copy_100228</w:t>
       </w:r>
@@ -26,6 +24,11 @@
       </w:pPr>
       <w:r>
         <w:t>Technical Specification Document</w:t>
+      </w:r>
+    </w:p>
+    <w:p>
+      <w:r>
+        <w:br/>
       </w:r>
     </w:p>
     <w:tbl>
@@ -120,84 +123,114 @@
       </w:r>
     </w:p>
     <w:p>
+      <w:pPr>
+        <w:spacing w:after="40"/>
+      </w:pPr>
       <w:r>
         <w:t>1. Introduction</w:t>
       </w:r>
     </w:p>
     <w:p>
       <w:pPr>
+        <w:spacing w:after="40"/>
         <w:ind w:left="432"/>
       </w:pPr>
       <w:r>
-        <w:t xml:space="preserve">  1.1 Purpose</w:t>
+        <w:t>1.1 Purpose</w:t>
       </w:r>
     </w:p>
     <w:p>
       <w:pPr>
+        <w:spacing w:after="40"/>
         <w:ind w:left="432"/>
       </w:pPr>
       <w:r>
-        <w:t xml:space="preserve">  1.2 Scope</w:t>
+        <w:t>1.2 Scope</w:t>
       </w:r>
     </w:p>
     <w:p>
+      <w:pPr>
+        <w:spacing w:after="40"/>
+      </w:pPr>
       <w:r>
         <w:t>2. Integration Overview</w:t>
       </w:r>
     </w:p>
     <w:p>
       <w:pPr>
+        <w:spacing w:after="40"/>
         <w:ind w:left="432"/>
       </w:pPr>
       <w:r>
-        <w:t xml:space="preserve">  2.1 Integration Architecture</w:t>
+        <w:t>2.1 Integration Architecture</w:t>
       </w:r>
     </w:p>
     <w:p>
       <w:pPr>
+        <w:spacing w:after="40"/>
         <w:ind w:left="432"/>
       </w:pPr>
       <w:r>
-        <w:t xml:space="preserve">  2.2 Integration Components</w:t>
+        <w:t>2.2 Integration Components</w:t>
       </w:r>
     </w:p>
     <w:p>
+      <w:pPr>
+        <w:spacing w:after="40"/>
+      </w:pPr>
       <w:r>
         <w:t>3. Integration Scenarios</w:t>
       </w:r>
     </w:p>
     <w:p>
       <w:pPr>
+        <w:spacing w:after="40"/>
         <w:ind w:left="432"/>
       </w:pPr>
       <w:r>
-        <w:t xml:space="preserve">  3.1 Scenario Description</w:t>
+        <w:t>3.1 Scenario Description</w:t>
       </w:r>
     </w:p>
     <w:p>
       <w:pPr>
+        <w:spacing w:after="40"/>
         <w:ind w:left="432"/>
       </w:pPr>
       <w:r>
-        <w:t xml:space="preserve">  3.2 Data Flows</w:t>
+        <w:t>3.2 Data Flows</w:t>
       </w:r>
     </w:p>
     <w:p>
       <w:pPr>
+        <w:spacing w:after="40"/>
         <w:ind w:left="432"/>
       </w:pPr>
       <w:r>
-        <w:t xml:space="preserve">  3.3 Security Requirements</w:t>
+        <w:t>3.3 Security Requirements</w:t>
       </w:r>
     </w:p>
     <w:p>
+      <w:pPr>
+        <w:spacing w:after="40"/>
+      </w:pPr>
       <w:r>
-        <w:t>4. Error Handling</w:t>
+        <w:t>4. Error Handling and Logging</w:t>
       </w:r>
     </w:p>
     <w:p>
+      <w:pPr>
+        <w:spacing w:after="40"/>
+      </w:pPr>
       <w:r>
         <w:t>5. Testing Validation</w:t>
+      </w:r>
+    </w:p>
+    <w:p>
+      <w:pPr>
+        <w:spacing w:after="40"/>
+      </w:pPr>
+      <w:r>
+        <w:t>6. Reference Documents</w:t>
       </w:r>
     </w:p>
     <w:p>
@@ -208,6 +241,7 @@
     <w:p>
       <w:pPr>
         <w:pStyle w:val="Heading1"/>
+        <w:spacing w:before="240" w:after="120"/>
       </w:pPr>
       <w:r>
         <w:rPr>
@@ -220,6 +254,7 @@
     <w:p>
       <w:pPr>
         <w:pStyle w:val="Heading2"/>
+        <w:spacing w:before="240" w:after="120"/>
       </w:pPr>
       <w:r>
         <w:rPr>
@@ -230,13 +265,17 @@
       </w:r>
     </w:p>
     <w:p>
+      <w:pPr>
+        <w:spacing w:after="120"/>
+      </w:pPr>
       <w:r>
-        <w:t>This iFlow is designed to facilitate the process of employee creation from SuccessFactors (SF) to S/4 HANA using the MDF (Metadata Framework).</w:t>
+        <w:t>The iFlow PRD_IF_EmployeeCreation_SF_to_S4_MDF_copy_100228 is designed to facilitate the employee creation process by integrating data from SuccessFactors (SF) to SAP S/4HANA using Master Data Framework (MDF).</w:t>
       </w:r>
     </w:p>
     <w:p>
       <w:pPr>
         <w:pStyle w:val="Heading2"/>
+        <w:spacing w:before="240" w:after="120"/>
       </w:pPr>
       <w:r>
         <w:rPr>
@@ -247,13 +286,17 @@
       </w:r>
     </w:p>
     <w:p>
+      <w:pPr>
+        <w:spacing w:after="120"/>
+      </w:pPr>
       <w:r>
-        <w:t>The integration flow targets the mapping and transfer of employee-related data from SuccessFactors to the S/4 HANA environment, ensuring that all necessary fields and attributes are correctly populated and synchronized.</w:t>
+        <w:t>This iFlow covers the end-to-end data transformation and exchange between SuccessFactors and SAP S/4HANA, allowing for accurate and timely employee data management across systems.</w:t>
       </w:r>
     </w:p>
     <w:p>
       <w:pPr>
         <w:pStyle w:val="Heading1"/>
+        <w:spacing w:before="240" w:after="120"/>
       </w:pPr>
       <w:r>
         <w:rPr>
@@ -266,6 +309,7 @@
     <w:p>
       <w:pPr>
         <w:pStyle w:val="Heading2"/>
+        <w:spacing w:before="240" w:after="120"/>
       </w:pPr>
       <w:r>
         <w:rPr>
@@ -276,47 +320,14 @@
       </w:r>
     </w:p>
     <w:p>
-      <w:pPr>
-        <w:jc w:val="center"/>
-      </w:pPr>
       <w:r>
-        <w:drawing>
-          <wp:inline xmlns:a="http://schemas.openxmlformats.org/drawingml/2006/main" xmlns:pic="http://schemas.openxmlformats.org/drawingml/2006/picture">
-            <wp:extent cx="5029200" cy="7398026"/>
-            <wp:docPr id="1" name="Picture 1"/>
-            <wp:cNvGraphicFramePr>
-              <a:graphicFrameLocks noChangeAspect="1"/>
-            </wp:cNvGraphicFramePr>
-            <a:graphic>
-              <a:graphicData uri="http://schemas.openxmlformats.org/drawingml/2006/picture">
-                <pic:pic>
-                  <pic:nvPicPr>
-                    <pic:cNvPr id="0" name="diagram.png"/>
-                    <pic:cNvPicPr/>
-                  </pic:nvPicPr>
-                  <pic:blipFill>
-                    <a:blip r:embed="rId10"/>
-                    <a:stretch>
-                      <a:fillRect/>
-                    </a:stretch>
-                  </pic:blipFill>
-                  <pic:spPr>
-                    <a:xfrm>
-                      <a:off x="0" y="0"/>
-                      <a:ext cx="5029200" cy="7398026"/>
-                    </a:xfrm>
-                    <a:prstGeom prst="rect"/>
-                  </pic:spPr>
-                </pic:pic>
-              </a:graphicData>
-            </a:graphic>
-          </wp:inline>
-        </w:drawing>
+        <w:t>{'integration_platform': 'SAP Cloud Platform Integration (CPI)', 'data_sources': 'SuccessFactors (Employee Central)', 'data_destinations': 'SAP S/4HANA (MDF)', 'protocols': ['OData', 'REST', 'SOAP'], 'design_patterns': ['Message Transformation', 'Data Mapping', 'Content Enrichment']}</w:t>
       </w:r>
     </w:p>
     <w:p>
       <w:pPr>
         <w:pStyle w:val="Heading2"/>
+        <w:spacing w:before="240" w:after="120"/>
       </w:pPr>
       <w:r>
         <w:rPr>
@@ -326,152 +337,18 @@
         <w:t>2.2 Integration Components</w:t>
       </w:r>
     </w:p>
-    <w:tbl>
-      <w:tblPr>
-        <w:tblStyle w:val="TableGrid"/>
-        <w:tblW w:type="auto" w:w="0"/>
-        <w:tblLook w:firstColumn="1" w:firstRow="1" w:lastColumn="0" w:lastRow="0" w:noHBand="0" w:noVBand="1" w:val="04A0"/>
-      </w:tblPr>
-      <w:tblGrid>
-        <w:gridCol w:w="4320"/>
-        <w:gridCol w:w="4320"/>
-      </w:tblGrid>
-      <w:tr>
-        <w:tc>
-          <w:tcPr>
-            <w:tcW w:type="dxa" w:w="4320"/>
-          </w:tcPr>
-          <w:p>
-            <w:r>
-              <w:t>Component</w:t>
-            </w:r>
-          </w:p>
-        </w:tc>
-        <w:tc>
-          <w:tcPr>
-            <w:tcW w:type="dxa" w:w="4320"/>
-          </w:tcPr>
-          <w:p>
-            <w:r>
-              <w:t>Value</w:t>
-            </w:r>
-          </w:p>
-        </w:tc>
-      </w:tr>
-      <w:tr>
-        <w:tc>
-          <w:tcPr>
-            <w:tcW w:type="dxa" w:w="4320"/>
-          </w:tcPr>
-          <w:p>
-            <w:r>
-              <w:t>success_factors_system</w:t>
-            </w:r>
-          </w:p>
-        </w:tc>
-        <w:tc>
-          <w:tcPr>
-            <w:tcW w:type="dxa" w:w="4320"/>
-          </w:tcPr>
-          <w:p>
-            <w:r>
-              <w:t>{'type': 'Source', 'description': 'SuccessFactors system where employee data is originated.'}</w:t>
-            </w:r>
-          </w:p>
-        </w:tc>
-      </w:tr>
-      <w:tr>
-        <w:tc>
-          <w:tcPr>
-            <w:tcW w:type="dxa" w:w="4320"/>
-          </w:tcPr>
-          <w:p>
-            <w:r>
-              <w:t>iFlow</w:t>
-            </w:r>
-          </w:p>
-        </w:tc>
-        <w:tc>
-          <w:tcPr>
-            <w:tcW w:type="dxa" w:w="4320"/>
-          </w:tcPr>
-          <w:p>
-            <w:r>
-              <w:t>{'type': 'Integration Flow', 'description': 'Handles the logic for transforming and routing data.'}</w:t>
-            </w:r>
-          </w:p>
-        </w:tc>
-      </w:tr>
-      <w:tr>
-        <w:tc>
-          <w:tcPr>
-            <w:tcW w:type="dxa" w:w="4320"/>
-          </w:tcPr>
-          <w:p>
-            <w:r>
-              <w:t>s4hana_system</w:t>
-            </w:r>
-          </w:p>
-        </w:tc>
-        <w:tc>
-          <w:tcPr>
-            <w:tcW w:type="dxa" w:w="4320"/>
-          </w:tcPr>
-          <w:p>
-            <w:r>
-              <w:t>{'type': 'Target', 'description': 'S/4 HANA system where employee data is stored.'}</w:t>
-            </w:r>
-          </w:p>
-        </w:tc>
-      </w:tr>
-      <w:tr>
-        <w:tc>
-          <w:tcPr>
-            <w:tcW w:type="dxa" w:w="4320"/>
-          </w:tcPr>
-          <w:p>
-            <w:r>
-              <w:t>data_transformation</w:t>
-            </w:r>
-          </w:p>
-        </w:tc>
-        <w:tc>
-          <w:tcPr>
-            <w:tcW w:type="dxa" w:w="4320"/>
-          </w:tcPr>
-          <w:p>
-            <w:r>
-              <w:t>{'type': 'Transformation Logic', 'description': 'Mapping and transformation rules applied to the incoming data.'}</w:t>
-            </w:r>
-          </w:p>
-        </w:tc>
-      </w:tr>
-      <w:tr>
-        <w:tc>
-          <w:tcPr>
-            <w:tcW w:type="dxa" w:w="4320"/>
-          </w:tcPr>
-          <w:p>
-            <w:r>
-              <w:t>notification_service</w:t>
-            </w:r>
-          </w:p>
-        </w:tc>
-        <w:tc>
-          <w:tcPr>
-            <w:tcW w:type="dxa" w:w="4320"/>
-          </w:tcPr>
-          <w:p>
-            <w:r>
-              <w:t>{'type': 'Service', 'description': 'Service to send notifications after successful data processing.'}</w:t>
-            </w:r>
-          </w:p>
-        </w:tc>
-      </w:tr>
-    </w:tbl>
+    <w:p>
+      <w:pPr>
+        <w:spacing w:after="120"/>
+      </w:pPr>
+      <w:r>
+        <w:t>{'iFlow': 'PRD_IF_EmployeeCreation_SF_to_S4_MDF_copy_100228', 'message_mapping': 'Employee Data Mapping Logic', 'groovy_scripts': 'Data Transformation and Validation Scripts', 'APIs': ['SuccessFactors Employee API', 'S4HANA MDF API'], 'error_handling': 'Global Error Handling Logic'}</w:t>
+      </w:r>
+    </w:p>
     <w:p>
       <w:pPr>
         <w:pStyle w:val="Heading1"/>
+        <w:spacing w:before="240" w:after="120"/>
       </w:pPr>
       <w:r>
         <w:rPr>
@@ -484,6 +361,7 @@
     <w:p>
       <w:pPr>
         <w:pStyle w:val="Heading2"/>
+        <w:spacing w:before="240" w:after="120"/>
       </w:pPr>
       <w:r>
         <w:rPr>
@@ -494,13 +372,17 @@
       </w:r>
     </w:p>
     <w:p>
+      <w:pPr>
+        <w:spacing w:after="120"/>
+      </w:pPr>
       <w:r>
-        <w:t>The iFlow initiates the employee creation process by extracting employee data from the SuccessFactors system. It then transforms this data to match the structure expected by the S/4 HANA environment and pushes the data into the target system. The process concludes with a notification confirming the successful creation of the employee record.</w:t>
+        <w:t>The iFlow operates as follows: when a new employee is created in SuccessFactors, the relevant employee data is captured and transformed to match the MDF requirements for SAP S/4HANA. The transformed data is then sent to SAP S/4HANA to create a new employee record.</w:t>
       </w:r>
     </w:p>
     <w:p>
       <w:pPr>
         <w:pStyle w:val="Heading2"/>
+        <w:spacing w:before="240" w:after="120"/>
       </w:pPr>
       <w:r>
         <w:rPr>
@@ -510,213 +392,18 @@
         <w:t>3.2 Data Flows</w:t>
       </w:r>
     </w:p>
-    <w:tbl>
-      <w:tblPr>
-        <w:tblStyle w:val="TableGrid"/>
-        <w:tblW w:type="auto" w:w="0"/>
-        <w:tblLook w:firstColumn="1" w:firstRow="1" w:lastColumn="0" w:lastRow="0" w:noHBand="0" w:noVBand="1" w:val="04A0"/>
-      </w:tblPr>
-      <w:tblGrid>
-        <w:gridCol w:w="2880"/>
-        <w:gridCol w:w="2880"/>
-        <w:gridCol w:w="2880"/>
-      </w:tblGrid>
-      <w:tr>
-        <w:tc>
-          <w:tcPr>
-            <w:tcW w:type="dxa" w:w="2880"/>
-          </w:tcPr>
-          <w:p>
-            <w:r>
-              <w:t>Source Field</w:t>
-            </w:r>
-          </w:p>
-        </w:tc>
-        <w:tc>
-          <w:tcPr>
-            <w:tcW w:type="dxa" w:w="2880"/>
-          </w:tcPr>
-          <w:p>
-            <w:r>
-              <w:t>Target Field</w:t>
-            </w:r>
-          </w:p>
-        </w:tc>
-        <w:tc>
-          <w:tcPr>
-            <w:tcW w:type="dxa" w:w="2880"/>
-          </w:tcPr>
-          <w:p>
-            <w:r>
-              <w:t>Logic</w:t>
-            </w:r>
-          </w:p>
-        </w:tc>
-      </w:tr>
-      <w:tr>
-        <w:tc>
-          <w:tcPr>
-            <w:tcW w:type="dxa" w:w="2880"/>
-          </w:tcPr>
-          <w:p>
-            <w:r>
-              <w:t>SuccessFactors.employeeName</w:t>
-            </w:r>
-          </w:p>
-        </w:tc>
-        <w:tc>
-          <w:tcPr>
-            <w:tcW w:type="dxa" w:w="2880"/>
-          </w:tcPr>
-          <w:p>
-            <w:r>
-              <w:t>S4HANA.employeeName</w:t>
-            </w:r>
-          </w:p>
-        </w:tc>
-        <w:tc>
-          <w:tcPr>
-            <w:tcW w:type="dxa" w:w="2880"/>
-          </w:tcPr>
-          <w:p>
-            <w:r>
-              <w:t>Direct mapping</w:t>
-            </w:r>
-          </w:p>
-        </w:tc>
-      </w:tr>
-      <w:tr>
-        <w:tc>
-          <w:tcPr>
-            <w:tcW w:type="dxa" w:w="2880"/>
-          </w:tcPr>
-          <w:p>
-            <w:r>
-              <w:t>SuccessFactors.employeeID</w:t>
-            </w:r>
-          </w:p>
-        </w:tc>
-        <w:tc>
-          <w:tcPr>
-            <w:tcW w:type="dxa" w:w="2880"/>
-          </w:tcPr>
-          <w:p>
-            <w:r>
-              <w:t>S4HANA.employeeId</w:t>
-            </w:r>
-          </w:p>
-        </w:tc>
-        <w:tc>
-          <w:tcPr>
-            <w:tcW w:type="dxa" w:w="2880"/>
-          </w:tcPr>
-          <w:p>
-            <w:r>
-              <w:t>Direct mapping</w:t>
-            </w:r>
-          </w:p>
-        </w:tc>
-      </w:tr>
-      <w:tr>
-        <w:tc>
-          <w:tcPr>
-            <w:tcW w:type="dxa" w:w="2880"/>
-          </w:tcPr>
-          <w:p>
-            <w:r>
-              <w:t>SuccessFactors.position</w:t>
-            </w:r>
-          </w:p>
-        </w:tc>
-        <w:tc>
-          <w:tcPr>
-            <w:tcW w:type="dxa" w:w="2880"/>
-          </w:tcPr>
-          <w:p>
-            <w:r>
-              <w:t>S4HANA.jobPosition</w:t>
-            </w:r>
-          </w:p>
-        </w:tc>
-        <w:tc>
-          <w:tcPr>
-            <w:tcW w:type="dxa" w:w="2880"/>
-          </w:tcPr>
-          <w:p>
-            <w:r>
-              <w:t>Direct mapping</w:t>
-            </w:r>
-          </w:p>
-        </w:tc>
-      </w:tr>
-      <w:tr>
-        <w:tc>
-          <w:tcPr>
-            <w:tcW w:type="dxa" w:w="2880"/>
-          </w:tcPr>
-          <w:p>
-            <w:r>
-              <w:t>SuccessFactors.department</w:t>
-            </w:r>
-          </w:p>
-        </w:tc>
-        <w:tc>
-          <w:tcPr>
-            <w:tcW w:type="dxa" w:w="2880"/>
-          </w:tcPr>
-          <w:p>
-            <w:r>
-              <w:t>S4HANA.departmentCode</w:t>
-            </w:r>
-          </w:p>
-        </w:tc>
-        <w:tc>
-          <w:tcPr>
-            <w:tcW w:type="dxa" w:w="2880"/>
-          </w:tcPr>
-          <w:p>
-            <w:r>
-              <w:t>Convert to department code format</w:t>
-            </w:r>
-          </w:p>
-        </w:tc>
-      </w:tr>
-      <w:tr>
-        <w:tc>
-          <w:tcPr>
-            <w:tcW w:type="dxa" w:w="2880"/>
-          </w:tcPr>
-          <w:p>
-            <w:r>
-              <w:t>SuccessFactors.hireDate</w:t>
-            </w:r>
-          </w:p>
-        </w:tc>
-        <w:tc>
-          <w:tcPr>
-            <w:tcW w:type="dxa" w:w="2880"/>
-          </w:tcPr>
-          <w:p>
-            <w:r>
-              <w:t>S4HANA.startDate</w:t>
-            </w:r>
-          </w:p>
-        </w:tc>
-        <w:tc>
-          <w:tcPr>
-            <w:tcW w:type="dxa" w:w="2880"/>
-          </w:tcPr>
-          <w:p>
-            <w:r>
-              <w:t>Format the date to YYYY-MM-DD</w:t>
-            </w:r>
-          </w:p>
-        </w:tc>
-      </w:tr>
-    </w:tbl>
+    <w:p>
+      <w:pPr>
+        <w:spacing w:after="120"/>
+      </w:pPr>
+      <w:r>
+        <w:t>[{'source': 'SuccessFactors', 'destination': 'SAP S/4HANA', 'data_format': 'JSON', 'trigger': 'Employee Creation Event'}]</w:t>
+      </w:r>
+    </w:p>
     <w:p>
       <w:pPr>
         <w:pStyle w:val="Heading2"/>
+        <w:spacing w:before="240" w:after="120"/>
       </w:pPr>
       <w:r>
         <w:rPr>
@@ -727,13 +414,17 @@
       </w:r>
     </w:p>
     <w:p>
+      <w:pPr>
+        <w:spacing w:after="120"/>
+      </w:pPr>
       <w:r>
-        <w:t>The iFlow implements secure connections via HTTPS to ensure data security in transit. Additionally, user authentication and authorization mechanisms are in place to restrict access to both the SuccessFactors and S/4 HANA environments.</w:t>
+        <w:t>{'authentication': 'OAuth 2.0 for API calls', 'encryption': 'TLS for data in transit', 'access_control': 'Role-based access control implemented in CPI'}</w:t>
       </w:r>
     </w:p>
     <w:p>
       <w:pPr>
         <w:pStyle w:val="Heading1"/>
+        <w:spacing w:before="240" w:after="120"/>
       </w:pPr>
       <w:r>
         <w:rPr>
@@ -744,13 +435,17 @@
       </w:r>
     </w:p>
     <w:p>
+      <w:pPr>
+        <w:spacing w:after="120"/>
+      </w:pPr>
       <w:r>
-        <w:t>In case of an error during data processing, the iFlow is designed to log the error details and send alerts to the integration team for troubleshooting. There are retries configured for transient errors.</w:t>
+        <w:t>{'error_detection': 'Errors detected in message mapping or data transformation phases', 'notification': 'Error notifications sent to designated support teams', 'retry_mechanism': 'Automatic retries for transient errors, with configurable limits'}</w:t>
       </w:r>
     </w:p>
     <w:p>
       <w:pPr>
         <w:pStyle w:val="Heading1"/>
+        <w:spacing w:before="240" w:after="120"/>
       </w:pPr>
       <w:r>
         <w:rPr>
@@ -761,8 +456,32 @@
       </w:r>
     </w:p>
     <w:p>
+      <w:pPr>
+        <w:spacing w:after="120"/>
+      </w:pPr>
       <w:r>
-        <w:t>The iFlow has undergone unit testing for individual components, as well as integration testing with both the SuccessFactors and S/4 HANA systems. End-to-end testing is also performed to ensure the complete workflow functions as expected.</w:t>
+        <w:t>{'unit_testing': 'Individual components tested for functionality', 'integration_testing': 'Full iFlow tested end-to-end for data accuracy', 'performance_testing': 'Load testing conducted to assess system responsiveness under peak loads'}</w:t>
+      </w:r>
+    </w:p>
+    <w:p>
+      <w:pPr>
+        <w:pStyle w:val="Heading1"/>
+        <w:spacing w:before="240" w:after="120"/>
+      </w:pPr>
+      <w:r>
+        <w:rPr>
+          <w:color w:val="1F3864"/>
+          <w:sz w:val="32"/>
+        </w:rPr>
+        <w:t>6. Reference Documents</w:t>
+      </w:r>
+    </w:p>
+    <w:p>
+      <w:pPr>
+        <w:spacing w:after="120"/>
+      </w:pPr>
+      <w:r>
+        <w:t>{'SAP_CPI_Documentation': 'https://help.sap.com/viewer/product/SAP_CLOUD_PLATFORM_INTEGRATION/3.0/en', 'SuccessFactors_API_Guide': 'https://help.sap.com/viewer/1baecd4494d740f3b92954aa3751f04c/latest/en-US', 'SAP_S4HANA_MDF_Resources': 'https://help.sap.com/viewer/product/SAP_S4HANA/2020/en'}</w:t>
       </w:r>
     </w:p>
     <w:sectPr>
@@ -801,7 +520,7 @@
           <w:r>
             <w:drawing>
               <wp:inline xmlns:a="http://schemas.openxmlformats.org/drawingml/2006/main" xmlns:pic="http://schemas.openxmlformats.org/drawingml/2006/picture">
-                <wp:extent cx="685800" cy="685800"/>
+                <wp:extent cx="365760" cy="365760"/>
                 <wp:docPr id="1" name="Picture 1"/>
                 <wp:cNvGraphicFramePr>
                   <a:graphicFrameLocks noChangeAspect="1"/>
@@ -810,7 +529,7 @@
                   <a:graphicData uri="http://schemas.openxmlformats.org/drawingml/2006/picture">
                     <pic:pic>
                       <pic:nvPicPr>
-                        <pic:cNvPr id="0" name="sap.jpg"/>
+                        <pic:cNvPr id="0" name="sap.png"/>
                         <pic:cNvPicPr/>
                       </pic:nvPicPr>
                       <pic:blipFill>
@@ -822,7 +541,7 @@
                       <pic:spPr>
                         <a:xfrm>
                           <a:off x="0" y="0"/>
-                          <a:ext cx="685800" cy="685800"/>
+                          <a:ext cx="365760" cy="365760"/>
                         </a:xfrm>
                         <a:prstGeom prst="rect"/>
                       </pic:spPr>
@@ -845,7 +564,7 @@
           <w:r>
             <w:drawing>
               <wp:inline xmlns:a="http://schemas.openxmlformats.org/drawingml/2006/main" xmlns:pic="http://schemas.openxmlformats.org/drawingml/2006/picture">
-                <wp:extent cx="685800" cy="685800"/>
+                <wp:extent cx="365760" cy="365760"/>
                 <wp:docPr id="2" name="Picture 2"/>
                 <wp:cNvGraphicFramePr>
                   <a:graphicFrameLocks noChangeAspect="1"/>
@@ -854,7 +573,7 @@
                   <a:graphicData uri="http://schemas.openxmlformats.org/drawingml/2006/picture">
                     <pic:pic>
                       <pic:nvPicPr>
-                        <pic:cNvPr id="0" name="mm.png"/>
+                        <pic:cNvPr id="0" name="motiveminds.png"/>
                         <pic:cNvPicPr/>
                       </pic:nvPicPr>
                       <pic:blipFill>
@@ -866,7 +585,7 @@
                       <pic:spPr>
                         <a:xfrm>
                           <a:off x="0" y="0"/>
-                          <a:ext cx="685800" cy="685800"/>
+                          <a:ext cx="365760" cy="365760"/>
                         </a:xfrm>
                         <a:prstGeom prst="rect"/>
                       </pic:spPr>

</xml_diff>

<commit_message>
🤖 DOCS: Large logos and compact ToC spacing
</commit_message>
<xml_diff>
--- a/cpi-artifacts/Employedata/PRD_IF_EmployeeCreation_SF_to_S4_MDF_copy_100228/PRD_IF_EmployeeCreation_SF_to_S4_MDF_copy_100228.docx
+++ b/cpi-artifacts/Employedata/PRD_IF_EmployeeCreation_SF_to_S4_MDF_copy_100228/PRD_IF_EmployeeCreation_SF_to_S4_MDF_copy_100228.docx
@@ -124,7 +124,7 @@
     </w:p>
     <w:p>
       <w:pPr>
-        <w:spacing w:after="40"/>
+        <w:spacing w:after="0"/>
       </w:pPr>
       <w:r>
         <w:t>1. Introduction</w:t>
@@ -132,7 +132,7 @@
     </w:p>
     <w:p>
       <w:pPr>
-        <w:spacing w:after="40"/>
+        <w:spacing w:after="0"/>
         <w:ind w:left="432"/>
       </w:pPr>
       <w:r>
@@ -141,7 +141,7 @@
     </w:p>
     <w:p>
       <w:pPr>
-        <w:spacing w:after="40"/>
+        <w:spacing w:after="0"/>
         <w:ind w:left="432"/>
       </w:pPr>
       <w:r>
@@ -150,7 +150,7 @@
     </w:p>
     <w:p>
       <w:pPr>
-        <w:spacing w:after="40"/>
+        <w:spacing w:after="0"/>
       </w:pPr>
       <w:r>
         <w:t>2. Integration Overview</w:t>
@@ -158,7 +158,7 @@
     </w:p>
     <w:p>
       <w:pPr>
-        <w:spacing w:after="40"/>
+        <w:spacing w:after="0"/>
         <w:ind w:left="432"/>
       </w:pPr>
       <w:r>
@@ -167,7 +167,7 @@
     </w:p>
     <w:p>
       <w:pPr>
-        <w:spacing w:after="40"/>
+        <w:spacing w:after="0"/>
         <w:ind w:left="432"/>
       </w:pPr>
       <w:r>
@@ -176,7 +176,7 @@
     </w:p>
     <w:p>
       <w:pPr>
-        <w:spacing w:after="40"/>
+        <w:spacing w:after="0"/>
       </w:pPr>
       <w:r>
         <w:t>3. Integration Scenarios</w:t>
@@ -184,7 +184,7 @@
     </w:p>
     <w:p>
       <w:pPr>
-        <w:spacing w:after="40"/>
+        <w:spacing w:after="0"/>
         <w:ind w:left="432"/>
       </w:pPr>
       <w:r>
@@ -193,7 +193,7 @@
     </w:p>
     <w:p>
       <w:pPr>
-        <w:spacing w:after="40"/>
+        <w:spacing w:after="0"/>
         <w:ind w:left="432"/>
       </w:pPr>
       <w:r>
@@ -202,7 +202,7 @@
     </w:p>
     <w:p>
       <w:pPr>
-        <w:spacing w:after="40"/>
+        <w:spacing w:after="0"/>
         <w:ind w:left="432"/>
       </w:pPr>
       <w:r>
@@ -211,7 +211,7 @@
     </w:p>
     <w:p>
       <w:pPr>
-        <w:spacing w:after="40"/>
+        <w:spacing w:after="0"/>
       </w:pPr>
       <w:r>
         <w:t>4. Error Handling and Logging</w:t>
@@ -219,7 +219,7 @@
     </w:p>
     <w:p>
       <w:pPr>
-        <w:spacing w:after="40"/>
+        <w:spacing w:after="0"/>
       </w:pPr>
       <w:r>
         <w:t>5. Testing Validation</w:t>
@@ -227,7 +227,7 @@
     </w:p>
     <w:p>
       <w:pPr>
-        <w:spacing w:after="40"/>
+        <w:spacing w:after="0"/>
       </w:pPr>
       <w:r>
         <w:t>6. Reference Documents</w:t>
@@ -269,7 +269,7 @@
         <w:spacing w:after="120"/>
       </w:pPr>
       <w:r>
-        <w:t>The iFlow PRD_IF_EmployeeCreation_SF_to_S4_MDF_copy_100228 is designed to facilitate the employee creation process by integrating data from SuccessFactors (SF) to SAP S/4HANA using Master Data Framework (MDF).</w:t>
+        <w:t>To facilitate the transfer of employee creation data from SuccessFactors (SF) to SAP S/4HANA using a predefined integration flow (iFlow), ensuring accurate and timely data synchronization between the systems.</w:t>
       </w:r>
     </w:p>
     <w:p>
@@ -290,7 +290,7 @@
         <w:spacing w:after="120"/>
       </w:pPr>
       <w:r>
-        <w:t>This iFlow covers the end-to-end data transformation and exchange between SuccessFactors and SAP S/4HANA, allowing for accurate and timely employee data management across systems.</w:t>
+        <w:t>This iFlow integrates employee creation events from SuccessFactors Employee Central into the SAP S/4HANA system. It includes mapping of relevant employee attributes and error handling for data discrepancies.</w:t>
       </w:r>
     </w:p>
     <w:p>
@@ -320,8 +320,11 @@
       </w:r>
     </w:p>
     <w:p>
+      <w:pPr>
+        <w:spacing w:after="120"/>
+      </w:pPr>
       <w:r>
-        <w:t>{'integration_platform': 'SAP Cloud Platform Integration (CPI)', 'data_sources': 'SuccessFactors (Employee Central)', 'data_destinations': 'SAP S/4HANA (MDF)', 'protocols': ['OData', 'REST', 'SOAP'], 'design_patterns': ['Message Transformation', 'Data Mapping', 'Content Enrichment']}</w:t>
+        <w:t>{'description': 'The architecture consists of SuccessFactors as the source system, SAP Cloud Platform Integration (CPI) as the middleware, and SAP S/4HANA as the target system. The iFlow handles message processing, transformation, and routing between these systems.', 'components': {'source_system': 'SAP SuccessFactors', 'middleware': 'SAP Cloud Platform Integration (CPI)', 'target_system': 'SAP S/4HANA'}}</w:t>
       </w:r>
     </w:p>
     <w:p>
@@ -342,7 +345,7 @@
         <w:spacing w:after="120"/>
       </w:pPr>
       <w:r>
-        <w:t>{'iFlow': 'PRD_IF_EmployeeCreation_SF_to_S4_MDF_copy_100228', 'message_mapping': 'Employee Data Mapping Logic', 'groovy_scripts': 'Data Transformation and Validation Scripts', 'APIs': ['SuccessFactors Employee API', 'S4HANA MDF API'], 'error_handling': 'Global Error Handling Logic'}</w:t>
+        <w:t>{'iFlow': 'PRD_IF_EmployeeCreation_SF_to_S4_MDF_copy_100228', 'communication_protocol': 'HTTPS', 'message_format': 'JSON or XML', 'transformation_tool': 'SAP CPI graphical mapping tools'}</w:t>
       </w:r>
     </w:p>
     <w:p>
@@ -376,7 +379,7 @@
         <w:spacing w:after="120"/>
       </w:pPr>
       <w:r>
-        <w:t>The iFlow operates as follows: when a new employee is created in SuccessFactors, the relevant employee data is captured and transformed to match the MDF requirements for SAP S/4HANA. The transformed data is then sent to SAP S/4HANA to create a new employee record.</w:t>
+        <w:t>Triggered by an employee creation event in SuccessFactors, the iFlow retrieves data, performs necessary transformations, and sends the relevant employee information to S/4HANA for record creation and management.</w:t>
       </w:r>
     </w:p>
     <w:p>
@@ -397,7 +400,7 @@
         <w:spacing w:after="120"/>
       </w:pPr>
       <w:r>
-        <w:t>[{'source': 'SuccessFactors', 'destination': 'SAP S/4HANA', 'data_format': 'JSON', 'trigger': 'Employee Creation Event'}]</w:t>
+        <w:t>{'1': {'from': 'SuccessFactors', 'to': 'SAP CPI', 'event': 'Employee Creation', 'data_transformation': 'Mapping of employee attributes including name, email, job position, and department'}, '2': {'from': 'SAP CPI', 'to': 'SAP S/4HANA', 'event': 'Create Employee Record', 'data_format': 'JSON/XML'}}</w:t>
       </w:r>
     </w:p>
     <w:p>
@@ -418,7 +421,7 @@
         <w:spacing w:after="120"/>
       </w:pPr>
       <w:r>
-        <w:t>{'authentication': 'OAuth 2.0 for API calls', 'encryption': 'TLS for data in transit', 'access_control': 'Role-based access control implemented in CPI'}</w:t>
+        <w:t>{'authentication': 'OAuth 2.0 for SAP SuccessFactors integration', 'encryption': 'TLS 1.2 for secure data transmission', 'access_control': 'Defined roles and permissions in SAP CPI and S/4HANA to limit data accessibility'}</w:t>
       </w:r>
     </w:p>
     <w:p>
@@ -439,7 +442,7 @@
         <w:spacing w:after="120"/>
       </w:pPr>
       <w:r>
-        <w:t>{'error_detection': 'Errors detected in message mapping or data transformation phases', 'notification': 'Error notifications sent to designated support teams', 'retry_mechanism': 'Automatic retries for transient errors, with configurable limits'}</w:t>
+        <w:t>{'mechanism': 'Each stage of the iFlow includes error handling subprocesses that capture and log errors in data processing.', 'notification': 'Email alerts should be sent to system administrators for critical errors and retries are enabled for transient failures.'}</w:t>
       </w:r>
     </w:p>
     <w:p>
@@ -460,7 +463,7 @@
         <w:spacing w:after="120"/>
       </w:pPr>
       <w:r>
-        <w:t>{'unit_testing': 'Individual components tested for functionality', 'integration_testing': 'Full iFlow tested end-to-end for data accuracy', 'performance_testing': 'Load testing conducted to assess system responsiveness under peak loads'}</w:t>
+        <w:t>{'unit_testing': 'Testing individual components of the iFlow in isolation to ensure accurate functionality.', 'integration_testing': 'End-to-end testing between SuccessFactors and S/4HANA to verify data integrity and flow.', 'performance_testing': 'Testing system load capacity and response times during peak data processing events.'}</w:t>
       </w:r>
     </w:p>
     <w:p>
@@ -481,7 +484,7 @@
         <w:spacing w:after="120"/>
       </w:pPr>
       <w:r>
-        <w:t>{'SAP_CPI_Documentation': 'https://help.sap.com/viewer/product/SAP_CLOUD_PLATFORM_INTEGRATION/3.0/en', 'SuccessFactors_API_Guide': 'https://help.sap.com/viewer/1baecd4494d740f3b92954aa3751f04c/latest/en-US', 'SAP_S4HANA_MDF_Resources': 'https://help.sap.com/viewer/product/SAP_S4HANA/2020/en'}</w:t>
+        <w:t>{'SAP_CPI_documentation': 'https://help.sap.com/viewer/product/SAP_CLOUD_PLATFORM_INTEGRATION/2.0/en-US', 'SuccessFactors_API_guide': 'https://developer.successfactors.com/', 'S4HANA_integration_guide': 'https://help.sap.com/viewer/product/SAP_S4HANA_CLOUD/1902/en-US'}</w:t>
       </w:r>
     </w:p>
     <w:sectPr>
@@ -520,7 +523,7 @@
           <w:r>
             <w:drawing>
               <wp:inline xmlns:a="http://schemas.openxmlformats.org/drawingml/2006/main" xmlns:pic="http://schemas.openxmlformats.org/drawingml/2006/picture">
-                <wp:extent cx="365760" cy="365760"/>
+                <wp:extent cx="548640" cy="548640"/>
                 <wp:docPr id="1" name="Picture 1"/>
                 <wp:cNvGraphicFramePr>
                   <a:graphicFrameLocks noChangeAspect="1"/>
@@ -541,7 +544,7 @@
                       <pic:spPr>
                         <a:xfrm>
                           <a:off x="0" y="0"/>
-                          <a:ext cx="365760" cy="365760"/>
+                          <a:ext cx="548640" cy="548640"/>
                         </a:xfrm>
                         <a:prstGeom prst="rect"/>
                       </pic:spPr>
@@ -564,7 +567,7 @@
           <w:r>
             <w:drawing>
               <wp:inline xmlns:a="http://schemas.openxmlformats.org/drawingml/2006/main" xmlns:pic="http://schemas.openxmlformats.org/drawingml/2006/picture">
-                <wp:extent cx="365760" cy="365760"/>
+                <wp:extent cx="548640" cy="548640"/>
                 <wp:docPr id="2" name="Picture 2"/>
                 <wp:cNvGraphicFramePr>
                   <a:graphicFrameLocks noChangeAspect="1"/>
@@ -585,7 +588,7 @@
                       <pic:spPr>
                         <a:xfrm>
                           <a:off x="0" y="0"/>
-                          <a:ext cx="365760" cy="365760"/>
+                          <a:ext cx="548640" cy="548640"/>
                         </a:xfrm>
                         <a:prstGeom prst="rect"/>
                       </pic:spPr>

</xml_diff>